<commit_message>
feat(dignitatis): nova identidade visual — paleta Terracota & Azul-Noite
- Reescreve brand_guidelines.md com nova identidade visual completa:
  paleta Terracota/Azul-Noite/Areia, tipografia Fraunces+Source Sans Pro,
  duas vozes (formal/acessível), hierarquia tipográfica e aplicações

- Atualiza gerar_documentos.py e gerar_odt.py com nova paleta e fontes
  (Terracota #B54E31, Azul-Noite #0F1F3D, Areia #F9F5EF)

- Regenera 7 templates de documentos (ofício, relatório, comunicado em
  .docx/.odt e apresentação .pptx) com nova identidade

- Adiciona 5 variantes de logomarca em assets/images/:
  completo, compacto, ícone, escuro (navy monocromático), branco
  (para fundos escuros), geradas via assets/images/gerar_logos.py

Nota: logo final (símbolo abstrato clima+direitos humanos) pendente de
aprovação — candidatos gerados no Canva aguardam escolha do usuário.

https://claude.ai/code/session_01WaLtJBgvbHVcf7ozv4GQmZ
</commit_message>
<xml_diff>
--- a/assets/templates/dignitatis_comunicado.docx
+++ b/assets/templates/dignitatis_comunicado.docx
@@ -10,7 +10,7 @@
         <w:rPr>
           <w:rFonts w:ascii="Georgia" w:hAnsi="Georgia"/>
           <w:b/>
-          <w:color w:val="2D3D2F"/>
+          <w:color w:val="0F1F3D"/>
           <w:sz w:val="36"/>
         </w:rPr>
         <w:t>DIGNITATIS</w:t>
@@ -23,10 +23,10 @@
       <w:r>
         <w:rPr>
           <w:rFonts w:ascii="Georgia" w:hAnsi="Georgia"/>
-          <w:color w:val="8C9E8C"/>
+          <w:color w:val="9E8E7C"/>
           <w:sz w:val="16"/>
         </w:rPr>
-        <w:t>Dignidade · Dignidad · Tekó Porã · Ọlá</w:t>
+        <w:t>Direitos Humanos · Paraíba · Brasil</w:t>
       </w:r>
     </w:p>
     <w:p>
@@ -36,7 +36,7 @@
       <w:r>
         <w:rPr>
           <w:rFonts w:ascii="Calibri" w:hAnsi="Calibri"/>
-          <w:color w:val="4A7A5C"/>
+          <w:color w:val="B54E31"/>
           <w:sz w:val="18"/>
         </w:rPr>
         <w:t>Comunicado Institucional</w:t>
@@ -46,7 +46,7 @@
       <w:pPr>
         <w:spacing w:before="0" w:after="120"/>
         <w:pBdr>
-          <w:bottom w:val="single" w:sz="12" w:space="1" w:color="4A7A5C"/>
+          <w:bottom w:val="single" w:sz="12" w:space="1" w:color="B54E31"/>
         </w:pBdr>
       </w:pPr>
     </w:p>
@@ -165,7 +165,7 @@
         <w:rPr>
           <w:rFonts w:ascii="Calibri" w:hAnsi="Calibri"/>
           <w:b/>
-          <w:color w:val="4A7A5C"/>
+          <w:color w:val="B54E31"/>
           <w:sz w:val="20"/>
         </w:rPr>
         <w:t>DIGNITATIS</w:t>
@@ -175,7 +175,7 @@
       <w:pPr>
         <w:spacing w:before="0" w:after="120"/>
         <w:pBdr>
-          <w:bottom w:val="single" w:sz="6" w:space="1" w:color="4A7A5C"/>
+          <w:bottom w:val="single" w:sz="6" w:space="1" w:color="B54E31"/>
         </w:pBdr>
       </w:pPr>
     </w:p>
@@ -186,7 +186,7 @@
       <w:r>
         <w:rPr>
           <w:rFonts w:ascii="Calibri" w:hAnsi="Calibri"/>
-          <w:color w:val="8C9E8C"/>
+          <w:color w:val="9E8E7C"/>
           <w:sz w:val="14"/>
         </w:rPr>
         <w:t>[Nome Legal da Organização]  ·  CNPJ: [00.000.000/0000-00]  ·  [Endereço]  ·  [Cidade/UF]  ·  [e-mail]  ·  [site]</w:t>

</xml_diff>